<commit_message>
chore(team-c): submit local docs and platform setup for review
</commit_message>
<xml_diff>
--- a/docs/Ask_AI_Upstream_Pipeline_Call_Visit_Summaries.docx
+++ b/docs/Ask_AI_Upstream_Pipeline_Call_Visit_Summaries.docx
@@ -2,6 +2,16 @@
 <file path=word/document.xml><?xml version="1.0" encoding="utf-8"?>
 <w:document xmlns:wpc="http://schemas.microsoft.com/office/word/2010/wordprocessingCanvas" xmlns:mo="http://schemas.microsoft.com/office/mac/office/2008/main" xmlns:mc="http://schemas.openxmlformats.org/markup-compatibility/2006" xmlns:mv="urn:schemas-microsoft-com:mac:vml" xmlns:o="urn:schemas-microsoft-com:office:office" xmlns:r="http://schemas.openxmlformats.org/officeDocument/2006/relationships" xmlns:m="http://schemas.openxmlformats.org/officeDocument/2006/math" xmlns:v="urn:schemas-microsoft-com:vml" xmlns:wp14="http://schemas.microsoft.com/office/word/2010/wordprocessingDrawing" xmlns:wp="http://schemas.openxmlformats.org/drawingml/2006/wordprocessingDrawing" xmlns:w10="urn:schemas-microsoft-com:office:word" xmlns:w="http://schemas.openxmlformats.org/wordprocessingml/2006/main" xmlns:w14="http://schemas.microsoft.com/office/word/2010/wordml" xmlns:wpg="http://schemas.microsoft.com/office/word/2010/wordprocessingGroup" xmlns:wpi="http://schemas.microsoft.com/office/word/2010/wordprocessingInk" xmlns:wne="http://schemas.microsoft.com/office/word/2006/wordml" xmlns:wps="http://schemas.microsoft.com/office/word/2010/wordprocessingShape" mc:Ignorable="w14 wp14">
   <w:body>
+    <w:p>
+      <w:ins w:id="11" w:author="CareConnect Doc Refresh" w:date="2026-09-01T19:12:01Z">
+        <w:r>
+          <w:rPr>
+            <w:i/>
+          </w:rPr>
+          <w:t xml:space="preserve">[Track Changes] Revisions by CareConnect Doc Refresh on 2026-09-01. Open Review tab → All Markup to see insertions/deletions.</w:t>
+        </w:r>
+      </w:ins>
+    </w:p>
     <w:p>
       <w:pPr>
         <w:pStyle w:val="Title"/>
@@ -26,79 +36,99 @@
         <w:t>Documents how Ask AI receives indexed content from upstream summary producers using a single schema contract across phone calls and in-person visits.</w:t>
       </w:r>
     </w:p>
-    <w:p>
-      <w:r>
-        <w:rPr>
-          <w:highlight w:val="yellow"/>
-        </w:rPr>
-        <w:t>Codebase refresh: June 2026 (post PR #88 Bedrock/Claude, PR #89 participant handling)</w:t>
-      </w:r>
-    </w:p>
-    <w:p>
-      <w:pPr>
-        <w:pStyle w:val="ListBullet"/>
-      </w:pPr>
-      <w:r>
-        <w:t>AI chat opt-in: careconnect.ai.enabled=false by default in application-dev.properties; AIChatController and Bedrock beans load only when CARECONNECT_AI_ENABLED=true.</w:t>
-      </w:r>
-    </w:p>
-    <w:p>
-      <w:pPr>
-        <w:pStyle w:val="ListBullet"/>
-      </w:pPr>
-      <w:r>
-        <w:t>Primary AI provider is Bedrock (careconnect.ai.provider=bedrock) via AIServiceFactory → BedrockAIChatAdapter → BedrockAIChatService; DeepSeek chat path disabled (DefaultAIChatService throws).</w:t>
-      </w:r>
-    </w:p>
-    <w:p>
-      <w:pPr>
-        <w:pStyle w:val="ListBullet"/>
-      </w:pPr>
-      <w:r>
-        <w:t>BedrockModelSupport adds approved Claude Sonnet 4/4.5/4.6 and Nova models with inference-profile routing.</w:t>
-      </w:r>
-    </w:p>
-    <w:p>
-      <w:pPr>
-        <w:pStyle w:val="ListBullet"/>
-      </w:pPr>
-      <w:r>
-        <w:t>BedrockAIChatService sends user message only — MedicalContextService / PatientContextRetrievalService are not wired into the active Bedrock chat path (medical context injection gap).</w:t>
-      </w:r>
-    </w:p>
-    <w:p>
-      <w:pPr>
-        <w:pStyle w:val="ListBullet"/>
-      </w:pPr>
-      <w:r>
-        <w:t>Voice form AI (symptom/allergy): careconnect.deepseek.enabled=false in dev disables AiSymptomController and AiAllergyController even though matchIfMissing=true.</w:t>
-      </w:r>
-    </w:p>
-    <w:p>
-      <w:pPr>
-        <w:pStyle w:val="ListBullet"/>
-      </w:pPr>
-      <w:r>
-        <w:t>Video calls: frontend VideoCallService tracks participantUserIds and POSTs them on /end; CallController.mergeParticipantUserIds improves multi-party end detection; participant-left vs call-ended WS events.</w:t>
-      </w:r>
-    </w:p>
-    <w:p>
-      <w:pPr>
-        <w:pStyle w:val="ListBullet"/>
-      </w:pPr>
-      <w:r>
-        <w:t>ChimeService caches attendee credentials per (callId, userId) for idempotent re-join (no duplicate externalUserId errors).</w:t>
-      </w:r>
-    </w:p>
-    <w:p>
-      <w:pPr>
-        <w:pStyle w:val="ListBullet"/>
-      </w:pPr>
-      <w:r>
-        <w:t>Hybrid retrieval (retrieval_index_chunk, FTS, pgvector Ask AI gateway) still not implemented — gaps below remain open.</w:t>
-      </w:r>
-    </w:p>
-    <w:p/>
+    <w:ins w:id="1" w:author="CareConnect Doc Refresh" w:date="2026-09-01T19:12:01Z">
+      <w:p>
+        <w:r>
+          <w:rPr>
+            <w:highlight w:val="yellow"/>
+          </w:rPr>
+          <w:t>Codebase refresh: June 2026 (post PR #88 Bedrock/Claude, PR #89 participant handling)</w:t>
+        </w:r>
+      </w:p>
+    </w:ins>
+    <w:ins w:id="2" w:author="CareConnect Doc Refresh" w:date="2026-09-01T19:12:01Z">
+      <w:p>
+        <w:pPr>
+          <w:pStyle w:val="ListBullet"/>
+        </w:pPr>
+        <w:r>
+          <w:t>AI chat opt-in: careconnect.ai.enabled=false by default in application-dev.properties; AIChatController and Bedrock beans load only when CARECONNECT_AI_ENABLED=true.</w:t>
+        </w:r>
+      </w:p>
+    </w:ins>
+    <w:ins w:id="3" w:author="CareConnect Doc Refresh" w:date="2026-09-01T19:12:01Z">
+      <w:p>
+        <w:pPr>
+          <w:pStyle w:val="ListBullet"/>
+        </w:pPr>
+        <w:r>
+          <w:t>Primary AI provider is Bedrock (careconnect.ai.provider=bedrock) via AIServiceFactory → BedrockAIChatAdapter → BedrockAIChatService; DeepSeek chat path disabled (DefaultAIChatService throws).</w:t>
+        </w:r>
+      </w:p>
+    </w:ins>
+    <w:ins w:id="4" w:author="CareConnect Doc Refresh" w:date="2026-09-01T19:12:01Z">
+      <w:p>
+        <w:pPr>
+          <w:pStyle w:val="ListBullet"/>
+        </w:pPr>
+        <w:r>
+          <w:t>BedrockModelSupport adds approved Claude Sonnet 4/4.5/4.6 and Nova models with inference-profile routing.</w:t>
+        </w:r>
+      </w:p>
+    </w:ins>
+    <w:ins w:id="5" w:author="CareConnect Doc Refresh" w:date="2026-09-01T19:12:01Z">
+      <w:p>
+        <w:pPr>
+          <w:pStyle w:val="ListBullet"/>
+        </w:pPr>
+        <w:r>
+          <w:t>BedrockAIChatService sends user message only — MedicalContextService / PatientContextRetrievalService are not wired into the active Bedrock chat path (medical context injection gap).</w:t>
+        </w:r>
+      </w:p>
+    </w:ins>
+    <w:ins w:id="6" w:author="CareConnect Doc Refresh" w:date="2026-09-01T19:12:01Z">
+      <w:p>
+        <w:pPr>
+          <w:pStyle w:val="ListBullet"/>
+        </w:pPr>
+        <w:r>
+          <w:t>Voice form AI (symptom/allergy): careconnect.deepseek.enabled=false in dev disables AiSymptomController and AiAllergyController even though matchIfMissing=true.</w:t>
+        </w:r>
+      </w:p>
+    </w:ins>
+    <w:ins w:id="7" w:author="CareConnect Doc Refresh" w:date="2026-09-01T19:12:01Z">
+      <w:p>
+        <w:pPr>
+          <w:pStyle w:val="ListBullet"/>
+        </w:pPr>
+        <w:r>
+          <w:t>Video calls: frontend VideoCallService tracks participantUserIds and POSTs them on /end; CallController.mergeParticipantUserIds improves multi-party end detection; participant-left vs call-ended WS events.</w:t>
+        </w:r>
+      </w:p>
+    </w:ins>
+    <w:ins w:id="8" w:author="CareConnect Doc Refresh" w:date="2026-09-01T19:12:01Z">
+      <w:p>
+        <w:pPr>
+          <w:pStyle w:val="ListBullet"/>
+        </w:pPr>
+        <w:r>
+          <w:t>ChimeService caches attendee credentials per (callId, userId) for idempotent re-join (no duplicate externalUserId errors).</w:t>
+        </w:r>
+      </w:p>
+    </w:ins>
+    <w:ins w:id="9" w:author="CareConnect Doc Refresh" w:date="2026-09-01T19:12:01Z">
+      <w:p>
+        <w:pPr>
+          <w:pStyle w:val="ListBullet"/>
+        </w:pPr>
+        <w:r>
+          <w:t>Hybrid retrieval (retrieval_index_chunk, FTS, pgvector Ask AI gateway) still not implemented — gaps below remain open.</w:t>
+        </w:r>
+      </w:p>
+    </w:ins>
+    <w:ins w:id="10" w:author="CareConnect Doc Refresh" w:date="2026-09-01T19:12:01Z">
+      <w:p/>
+    </w:ins>
     <w:p>
       <w:pPr>
         <w:pStyle w:val="Heading1"/>
@@ -2880,12 +2910,6 @@
         <w:t>docs/Call_Transcript_Retrieval_Review.docx</w:t>
       </w:r>
     </w:p>
-    <w:sectPr>
-      <w:pgSz w:w="12240" w:h="15840"/>
-      <w:pgMar w:top="1440" w:right="1800" w:bottom="1440" w:left="1800" w:header="720" w:footer="720" w:gutter="0"/>
-      <w:cols w:space="720"/>
-      <w:docGrid w:linePitch="360"/>
-    </w:sectPr>
   </w:body>
 </w:document>
 </file>

</xml_diff>